<commit_message>
feat: add conditional architecture chapters
</commit_message>
<xml_diff>
--- a/templates/default-software-design-template.docx
+++ b/templates/default-software-design-template.docx
@@ -736,7 +736,7 @@
         <w:rPr>
           <w:color w:val="595959"/>
         </w:rPr>
-        <w:t>模板使用说明：替换灰色提示与示例行；未知元数据标为待确认。按需删除可选内容并更新编号、交叉引用与目录。</w:t>
+        <w:t>模板使用说明：替换灰色提示与示例行；未知元数据标为待确认。第 8～11 章为条件候选章节：全局影响时保留，局部影响时融合，无关时删除；保留时去掉标题中的‘条件候选’，并更新编号、交叉引用与目录。</w:t>
       </w:r>
     </w:p>
     <w:p>
@@ -1326,7 +1326,7 @@
         <w:rPr>
           <w:color w:val="595959"/>
         </w:rPr>
-        <w:t>说明约束、方案、备选项、选择理由和后果。并发、状态、实时性及部署内容按需融入本章或模块章节，不默认单列。</w:t>
+        <w:t>说明约束、方案、备选项、选择理由和后果。并发、状态、实时性及部署内容影响全局架构时使用对应候选章节；仅局部影响时融入本章或模块章节。</w:t>
       </w:r>
     </w:p>
     <w:p>
@@ -1691,7 +1691,71 @@
         <w:pStyle w:val="Heading1"/>
       </w:pPr>
       <w:r>
-        <w:t>8 异常与故障处理</w:t>
+        <w:t>8 多任务与并发设计（条件候选）</w:t>
+      </w:r>
+    </w:p>
+    <w:p>
+      <w:r>
+        <w:rPr>
+          <w:color w:val="595959"/>
+        </w:rPr>
+        <w:t>跨模块的执行上下文、通信、资源所有权、同步、调度域、背压或停机策略影响总体架构时保留；局部内容移入对应模块/接口/数据章节，无关时删除。线程优先级、周期、栈大小、队列深度和锁顺序等实现参数通常属于详细设计。</w:t>
+      </w:r>
+    </w:p>
+    <w:p>
+      <w:pPr>
+        <w:pStyle w:val="Heading1"/>
+      </w:pPr>
+      <w:r>
+        <w:t>9 状态行为设计（条件候选）</w:t>
+      </w:r>
+    </w:p>
+    <w:p>
+      <w:r>
+        <w:rPr>
+          <w:color w:val="595959"/>
+        </w:rPr>
+        <w:t>统一生命周期、运行模式、协议/工作流或恢复状态协调多个模块或构成外部契约时保留；局部状态移入对应模块，无关时删除。完整转移矩阵与处理器动作通常属于详细设计。</w:t>
+      </w:r>
+    </w:p>
+    <w:p>
+      <w:pPr>
+        <w:pStyle w:val="Heading1"/>
+      </w:pPr>
+      <w:r>
+        <w:t>10 性能、实时性与资源设计（条件候选）</w:t>
+      </w:r>
+    </w:p>
+    <w:p>
+      <w:r>
+        <w:rPr>
+          <w:color w:val="595959"/>
+        </w:rPr>
+        <w:t>端到端时延、吞吐、截止期、容量或 CPU/内存/存储/网络预算驱动跨模块划分和契约时保留；局部约束移入对应模块/接口/数据章节，无关时删除。区分需求、建议预算、实测值和待确认项，不虚构数值。</w:t>
+      </w:r>
+    </w:p>
+    <w:p>
+      <w:pPr>
+        <w:pStyle w:val="Heading1"/>
+      </w:pPr>
+      <w:r>
+        <w:t>11 部署、升级与兼容性设计（条件候选）</w:t>
+      </w:r>
+    </w:p>
+    <w:p>
+      <w:r>
+        <w:rPr>
+          <w:color w:val="595959"/>
+        </w:rPr>
+        <w:t>节点/进程/容器/固件映射、制品划分、发布回滚、迁移、升级可用性、ABI、交叉编译或工具链约束影响架构时保留；局部约束移入总体架构、接口或风险章节，无关时删除。常规编译命令、打包和安装步骤不属于概要设计。</w:t>
+      </w:r>
+    </w:p>
+    <w:p>
+      <w:pPr>
+        <w:pStyle w:val="Heading1"/>
+      </w:pPr>
+      <w:r>
+        <w:t>12 异常与故障处理</w:t>
       </w:r>
     </w:p>
     <w:tbl>
@@ -1847,7 +1911,7 @@
         <w:pStyle w:val="Heading1"/>
       </w:pPr>
       <w:r>
-        <w:t>9 日志与可观测性</w:t>
+        <w:t>13 日志与可观测性</w:t>
       </w:r>
     </w:p>
     <w:p>
@@ -1863,7 +1927,7 @@
         <w:pStyle w:val="Heading1"/>
       </w:pPr>
       <w:r>
-        <w:t>10 安全设计</w:t>
+        <w:t>14 安全设计</w:t>
       </w:r>
     </w:p>
     <w:p>
@@ -1879,7 +1943,7 @@
         <w:pStyle w:val="Heading1"/>
       </w:pPr>
       <w:r>
-        <w:t>11 可测试性设计</w:t>
+        <w:t>15 可测试性设计</w:t>
       </w:r>
     </w:p>
     <w:p>
@@ -1895,7 +1959,7 @@
         <w:pStyle w:val="Heading1"/>
       </w:pPr>
       <w:r>
-        <w:t>12 可维护性与扩展性</w:t>
+        <w:t>16 可维护性与扩展性</w:t>
       </w:r>
     </w:p>
     <w:p>
@@ -1911,7 +1975,7 @@
         <w:pStyle w:val="Heading1"/>
       </w:pPr>
       <w:r>
-        <w:t>13 风险约束与待确认项</w:t>
+        <w:t>17 风险约束与待确认项</w:t>
       </w:r>
     </w:p>
     <w:tbl>

</xml_diff>

<commit_message>
chore: rebuild default DOCX template
</commit_message>
<xml_diff>
--- a/templates/default-software-design-template.docx
+++ b/templates/default-software-design-template.docx
@@ -36,7 +36,8 @@
     <w:tbl>
       <w:tblPr>
         <w:tblStyle w:val="TableGrid"/>
-        <w:tblW w:type="auto" w:w="0"/>
+        <w:tblW w:type="dxa" w:w="6576"/>
+        <w:jc w:val="center"/>
         <w:tblLayout w:type="fixed"/>
         <w:tblLook w:firstColumn="1" w:firstRow="1" w:lastColumn="0" w:lastRow="0" w:noHBand="0" w:noVBand="1" w:val="04A0"/>
         <w:tblBorders>
@@ -49,8 +50,8 @@
         </w:tblBorders>
       </w:tblPr>
       <w:tblGrid>
-        <w:gridCol w:w="2268"/>
-        <w:gridCol w:w="7143"/>
+        <w:gridCol w:w="1814"/>
+        <w:gridCol w:w="4762"/>
       </w:tblGrid>
       <w:tr>
         <w:trPr>
@@ -59,13 +60,14 @@
         </w:trPr>
         <w:tc>
           <w:tcPr>
-            <w:tcW w:type="dxa" w:w="2268"/>
+            <w:tcW w:type="dxa" w:w="1814"/>
             <w:vAlign w:val="center"/>
             <w:shd w:fill="E8EDF2"/>
           </w:tcPr>
           <w:p>
             <w:pPr>
               <w:spacing w:after="100" w:before="100"/>
+              <w:ind w:firstLine="0" w:left="0"/>
             </w:pPr>
             <w:r>
               <w:rPr>
@@ -78,13 +80,14 @@
         </w:tc>
         <w:tc>
           <w:tcPr>
-            <w:tcW w:type="dxa" w:w="7143"/>
+            <w:tcW w:type="dxa" w:w="4762"/>
             <w:vAlign w:val="center"/>
             <w:shd w:fill="E8EDF2"/>
           </w:tcPr>
           <w:p>
             <w:pPr>
               <w:spacing w:after="100" w:before="100"/>
+              <w:ind w:firstLine="0" w:left="0"/>
             </w:pPr>
             <w:r>
               <w:rPr>
@@ -102,12 +105,13 @@
         </w:trPr>
         <w:tc>
           <w:tcPr>
-            <w:tcW w:type="dxa" w:w="2268"/>
+            <w:tcW w:type="dxa" w:w="1814"/>
             <w:vAlign w:val="center"/>
           </w:tcPr>
           <w:p>
             <w:pPr>
               <w:spacing w:after="100" w:before="100"/>
+              <w:ind w:firstLine="0" w:left="0"/>
             </w:pPr>
             <w:r>
               <w:rPr>
@@ -120,12 +124,13 @@
         </w:tc>
         <w:tc>
           <w:tcPr>
-            <w:tcW w:type="dxa" w:w="7143"/>
+            <w:tcW w:type="dxa" w:w="4762"/>
             <w:vAlign w:val="center"/>
           </w:tcPr>
           <w:p>
             <w:pPr>
               <w:spacing w:after="100" w:before="100"/>
+              <w:ind w:firstLine="0" w:left="0"/>
             </w:pPr>
             <w:r>
               <w:rPr>
@@ -143,12 +148,13 @@
         </w:trPr>
         <w:tc>
           <w:tcPr>
-            <w:tcW w:type="dxa" w:w="2268"/>
+            <w:tcW w:type="dxa" w:w="1814"/>
             <w:vAlign w:val="center"/>
           </w:tcPr>
           <w:p>
             <w:pPr>
               <w:spacing w:after="100" w:before="100"/>
+              <w:ind w:firstLine="0" w:left="0"/>
             </w:pPr>
             <w:r>
               <w:rPr>
@@ -161,12 +167,13 @@
         </w:tc>
         <w:tc>
           <w:tcPr>
-            <w:tcW w:type="dxa" w:w="7143"/>
+            <w:tcW w:type="dxa" w:w="4762"/>
             <w:vAlign w:val="center"/>
           </w:tcPr>
           <w:p>
             <w:pPr>
               <w:spacing w:after="100" w:before="100"/>
+              <w:ind w:firstLine="0" w:left="0"/>
             </w:pPr>
             <w:r>
               <w:rPr>
@@ -184,12 +191,13 @@
         </w:trPr>
         <w:tc>
           <w:tcPr>
-            <w:tcW w:type="dxa" w:w="2268"/>
+            <w:tcW w:type="dxa" w:w="1814"/>
             <w:vAlign w:val="center"/>
           </w:tcPr>
           <w:p>
             <w:pPr>
               <w:spacing w:after="100" w:before="100"/>
+              <w:ind w:firstLine="0" w:left="0"/>
             </w:pPr>
             <w:r>
               <w:rPr>
@@ -202,12 +210,13 @@
         </w:tc>
         <w:tc>
           <w:tcPr>
-            <w:tcW w:type="dxa" w:w="7143"/>
+            <w:tcW w:type="dxa" w:w="4762"/>
             <w:vAlign w:val="center"/>
           </w:tcPr>
           <w:p>
             <w:pPr>
               <w:spacing w:after="100" w:before="100"/>
+              <w:ind w:firstLine="0" w:left="0"/>
             </w:pPr>
             <w:r>
               <w:rPr>
@@ -225,12 +234,13 @@
         </w:trPr>
         <w:tc>
           <w:tcPr>
-            <w:tcW w:type="dxa" w:w="2268"/>
+            <w:tcW w:type="dxa" w:w="1814"/>
             <w:vAlign w:val="center"/>
           </w:tcPr>
           <w:p>
             <w:pPr>
               <w:spacing w:after="100" w:before="100"/>
+              <w:ind w:firstLine="0" w:left="0"/>
             </w:pPr>
             <w:r>
               <w:rPr>
@@ -243,12 +253,13 @@
         </w:tc>
         <w:tc>
           <w:tcPr>
-            <w:tcW w:type="dxa" w:w="7143"/>
+            <w:tcW w:type="dxa" w:w="4762"/>
             <w:vAlign w:val="center"/>
           </w:tcPr>
           <w:p>
             <w:pPr>
               <w:spacing w:after="100" w:before="100"/>
+              <w:ind w:firstLine="0" w:left="0"/>
             </w:pPr>
             <w:r>
               <w:rPr>
@@ -266,12 +277,13 @@
         </w:trPr>
         <w:tc>
           <w:tcPr>
-            <w:tcW w:type="dxa" w:w="2268"/>
+            <w:tcW w:type="dxa" w:w="1814"/>
             <w:vAlign w:val="center"/>
           </w:tcPr>
           <w:p>
             <w:pPr>
               <w:spacing w:after="100" w:before="100"/>
+              <w:ind w:firstLine="0" w:left="0"/>
             </w:pPr>
             <w:r>
               <w:rPr>
@@ -284,12 +296,13 @@
         </w:tc>
         <w:tc>
           <w:tcPr>
-            <w:tcW w:type="dxa" w:w="7143"/>
+            <w:tcW w:type="dxa" w:w="4762"/>
             <w:vAlign w:val="center"/>
           </w:tcPr>
           <w:p>
             <w:pPr>
               <w:spacing w:after="100" w:before="100"/>
+              <w:ind w:firstLine="0" w:left="0"/>
             </w:pPr>
             <w:r>
               <w:rPr>
@@ -307,12 +320,13 @@
         </w:trPr>
         <w:tc>
           <w:tcPr>
-            <w:tcW w:type="dxa" w:w="2268"/>
+            <w:tcW w:type="dxa" w:w="1814"/>
             <w:vAlign w:val="center"/>
           </w:tcPr>
           <w:p>
             <w:pPr>
               <w:spacing w:after="100" w:before="100"/>
+              <w:ind w:firstLine="0" w:left="0"/>
             </w:pPr>
             <w:r>
               <w:rPr>
@@ -325,12 +339,13 @@
         </w:tc>
         <w:tc>
           <w:tcPr>
-            <w:tcW w:type="dxa" w:w="7143"/>
+            <w:tcW w:type="dxa" w:w="4762"/>
             <w:vAlign w:val="center"/>
           </w:tcPr>
           <w:p>
             <w:pPr>
               <w:spacing w:after="100" w:before="100"/>
+              <w:ind w:firstLine="0" w:left="0"/>
             </w:pPr>
             <w:r>
               <w:rPr>
@@ -364,7 +379,8 @@
     <w:tbl>
       <w:tblPr>
         <w:tblStyle w:val="TableGrid"/>
-        <w:tblW w:type="auto" w:w="0"/>
+        <w:tblW w:type="dxa" w:w="9411"/>
+        <w:jc w:val="left"/>
         <w:tblLayout w:type="fixed"/>
         <w:tblLook w:firstColumn="1" w:firstRow="1" w:lastColumn="0" w:lastRow="0" w:noHBand="0" w:noVBand="1" w:val="04A0"/>
         <w:tblBorders>
@@ -394,6 +410,7 @@
           <w:p>
             <w:pPr>
               <w:spacing w:after="100" w:before="100"/>
+              <w:ind w:firstLine="0" w:left="0"/>
             </w:pPr>
             <w:r>
               <w:rPr>
@@ -413,6 +430,7 @@
           <w:p>
             <w:pPr>
               <w:spacing w:after="100" w:before="100"/>
+              <w:ind w:firstLine="0" w:left="0"/>
             </w:pPr>
             <w:r>
               <w:rPr>
@@ -436,6 +454,7 @@
           <w:p>
             <w:pPr>
               <w:spacing w:after="100" w:before="100"/>
+              <w:ind w:firstLine="0" w:left="0"/>
             </w:pPr>
             <w:r>
               <w:rPr>
@@ -454,6 +473,7 @@
           <w:p>
             <w:pPr>
               <w:spacing w:after="100" w:before="100"/>
+              <w:ind w:firstLine="0" w:left="0"/>
             </w:pPr>
             <w:r>
               <w:rPr>
@@ -477,6 +497,7 @@
           <w:p>
             <w:pPr>
               <w:spacing w:after="100" w:before="100"/>
+              <w:ind w:firstLine="0" w:left="0"/>
             </w:pPr>
             <w:r>
               <w:rPr>
@@ -495,6 +516,7 @@
           <w:p>
             <w:pPr>
               <w:spacing w:after="100" w:before="100"/>
+              <w:ind w:firstLine="0" w:left="0"/>
             </w:pPr>
             <w:r>
               <w:rPr>
@@ -523,7 +545,8 @@
     <w:tbl>
       <w:tblPr>
         <w:tblStyle w:val="TableGrid"/>
-        <w:tblW w:type="auto" w:w="0"/>
+        <w:tblW w:type="dxa" w:w="9412"/>
+        <w:jc w:val="left"/>
         <w:tblLayout w:type="fixed"/>
         <w:tblLook w:firstColumn="1" w:firstRow="1" w:lastColumn="0" w:lastRow="0" w:noHBand="0" w:noVBand="1" w:val="04A0"/>
         <w:tblBorders>
@@ -555,6 +578,7 @@
           <w:p>
             <w:pPr>
               <w:spacing w:after="100" w:before="100"/>
+              <w:ind w:firstLine="0" w:left="0"/>
             </w:pPr>
             <w:r>
               <w:rPr>
@@ -574,6 +598,7 @@
           <w:p>
             <w:pPr>
               <w:spacing w:after="100" w:before="100"/>
+              <w:ind w:firstLine="0" w:left="0"/>
             </w:pPr>
             <w:r>
               <w:rPr>
@@ -593,6 +618,7 @@
           <w:p>
             <w:pPr>
               <w:spacing w:after="100" w:before="100"/>
+              <w:ind w:firstLine="0" w:left="0"/>
             </w:pPr>
             <w:r>
               <w:rPr>
@@ -612,6 +638,7 @@
           <w:p>
             <w:pPr>
               <w:spacing w:after="100" w:before="100"/>
+              <w:ind w:firstLine="0" w:left="0"/>
             </w:pPr>
             <w:r>
               <w:rPr>
@@ -635,6 +662,7 @@
           <w:p>
             <w:pPr>
               <w:spacing w:after="100" w:before="100"/>
+              <w:ind w:firstLine="0" w:left="0"/>
             </w:pPr>
             <w:r>
               <w:rPr>
@@ -653,6 +681,7 @@
           <w:p>
             <w:pPr>
               <w:spacing w:after="100" w:before="100"/>
+              <w:ind w:firstLine="0" w:left="0"/>
             </w:pPr>
             <w:r>
               <w:rPr>
@@ -671,6 +700,7 @@
           <w:p>
             <w:pPr>
               <w:spacing w:after="100" w:before="100"/>
+              <w:ind w:firstLine="0" w:left="0"/>
             </w:pPr>
             <w:r>
               <w:rPr>
@@ -689,6 +719,7 @@
           <w:p>
             <w:pPr>
               <w:spacing w:after="100" w:before="100"/>
+              <w:ind w:firstLine="0" w:left="0"/>
             </w:pPr>
             <w:r>
               <w:rPr>
@@ -779,7 +810,8 @@
     <w:tbl>
       <w:tblPr>
         <w:tblStyle w:val="TableGrid"/>
-        <w:tblW w:type="auto" w:w="0"/>
+        <w:tblW w:type="dxa" w:w="9412"/>
+        <w:jc w:val="left"/>
         <w:tblLayout w:type="fixed"/>
         <w:tblLook w:firstColumn="1" w:firstRow="1" w:lastColumn="0" w:lastRow="0" w:noHBand="0" w:noVBand="1" w:val="04A0"/>
         <w:tblBorders>
@@ -810,6 +842,7 @@
           <w:p>
             <w:pPr>
               <w:spacing w:after="100" w:before="100"/>
+              <w:ind w:firstLine="0" w:left="0"/>
             </w:pPr>
             <w:r>
               <w:rPr>
@@ -829,6 +862,7 @@
           <w:p>
             <w:pPr>
               <w:spacing w:after="100" w:before="100"/>
+              <w:ind w:firstLine="0" w:left="0"/>
             </w:pPr>
             <w:r>
               <w:rPr>
@@ -848,6 +882,7 @@
           <w:p>
             <w:pPr>
               <w:spacing w:after="100" w:before="100"/>
+              <w:ind w:firstLine="0" w:left="0"/>
             </w:pPr>
             <w:r>
               <w:rPr>
@@ -871,6 +906,7 @@
           <w:p>
             <w:pPr>
               <w:spacing w:after="100" w:before="100"/>
+              <w:ind w:firstLine="0" w:left="0"/>
             </w:pPr>
             <w:r>
               <w:rPr>
@@ -889,6 +925,7 @@
           <w:p>
             <w:pPr>
               <w:spacing w:after="100" w:before="100"/>
+              <w:ind w:firstLine="0" w:left="0"/>
             </w:pPr>
             <w:r>
               <w:rPr>
@@ -907,6 +944,7 @@
           <w:p>
             <w:pPr>
               <w:spacing w:after="100" w:before="100"/>
+              <w:ind w:firstLine="0" w:left="0"/>
             </w:pPr>
             <w:r>
               <w:rPr>
@@ -935,7 +973,8 @@
     <w:tbl>
       <w:tblPr>
         <w:tblStyle w:val="TableGrid"/>
-        <w:tblW w:type="auto" w:w="0"/>
+        <w:tblW w:type="dxa" w:w="9412"/>
+        <w:jc w:val="left"/>
         <w:tblLayout w:type="fixed"/>
         <w:tblLook w:firstColumn="1" w:firstRow="1" w:lastColumn="0" w:lastRow="0" w:noHBand="0" w:noVBand="1" w:val="04A0"/>
         <w:tblBorders>
@@ -966,6 +1005,7 @@
           <w:p>
             <w:pPr>
               <w:spacing w:after="100" w:before="100"/>
+              <w:ind w:firstLine="0" w:left="0"/>
             </w:pPr>
             <w:r>
               <w:rPr>
@@ -985,6 +1025,7 @@
           <w:p>
             <w:pPr>
               <w:spacing w:after="100" w:before="100"/>
+              <w:ind w:firstLine="0" w:left="0"/>
             </w:pPr>
             <w:r>
               <w:rPr>
@@ -1004,6 +1045,7 @@
           <w:p>
             <w:pPr>
               <w:spacing w:after="100" w:before="100"/>
+              <w:ind w:firstLine="0" w:left="0"/>
             </w:pPr>
             <w:r>
               <w:rPr>
@@ -1027,6 +1069,7 @@
           <w:p>
             <w:pPr>
               <w:spacing w:after="100" w:before="100"/>
+              <w:ind w:firstLine="0" w:left="0"/>
             </w:pPr>
             <w:r>
               <w:rPr>
@@ -1045,6 +1088,7 @@
           <w:p>
             <w:pPr>
               <w:spacing w:after="100" w:before="100"/>
+              <w:ind w:firstLine="0" w:left="0"/>
             </w:pPr>
             <w:r>
               <w:rPr>
@@ -1063,6 +1107,7 @@
           <w:p>
             <w:pPr>
               <w:spacing w:after="100" w:before="100"/>
+              <w:ind w:firstLine="0" w:left="0"/>
             </w:pPr>
             <w:r>
               <w:rPr>
@@ -1152,7 +1197,8 @@
     <w:tbl>
       <w:tblPr>
         <w:tblStyle w:val="TableGrid"/>
-        <w:tblW w:type="auto" w:w="0"/>
+        <w:tblW w:type="dxa" w:w="9411"/>
+        <w:jc w:val="left"/>
         <w:tblLayout w:type="fixed"/>
         <w:tblLook w:firstColumn="1" w:firstRow="1" w:lastColumn="0" w:lastRow="0" w:noHBand="0" w:noVBand="1" w:val="04A0"/>
         <w:tblBorders>
@@ -1183,6 +1229,7 @@
           <w:p>
             <w:pPr>
               <w:spacing w:after="100" w:before="100"/>
+              <w:ind w:firstLine="0" w:left="0"/>
             </w:pPr>
             <w:r>
               <w:rPr>
@@ -1202,6 +1249,7 @@
           <w:p>
             <w:pPr>
               <w:spacing w:after="100" w:before="100"/>
+              <w:ind w:firstLine="0" w:left="0"/>
             </w:pPr>
             <w:r>
               <w:rPr>
@@ -1221,6 +1269,7 @@
           <w:p>
             <w:pPr>
               <w:spacing w:after="100" w:before="100"/>
+              <w:ind w:firstLine="0" w:left="0"/>
             </w:pPr>
             <w:r>
               <w:rPr>
@@ -1244,6 +1293,7 @@
           <w:p>
             <w:pPr>
               <w:spacing w:after="100" w:before="100"/>
+              <w:ind w:firstLine="0" w:left="0"/>
             </w:pPr>
             <w:r>
               <w:rPr>
@@ -1262,6 +1312,7 @@
           <w:p>
             <w:pPr>
               <w:spacing w:after="100" w:before="100"/>
+              <w:ind w:firstLine="0" w:left="0"/>
             </w:pPr>
             <w:r>
               <w:rPr>
@@ -1280,6 +1331,7 @@
           <w:p>
             <w:pPr>
               <w:spacing w:after="100" w:before="100"/>
+              <w:ind w:firstLine="0" w:left="0"/>
             </w:pPr>
             <w:r>
               <w:rPr>
@@ -1364,7 +1416,8 @@
     <w:tbl>
       <w:tblPr>
         <w:tblStyle w:val="TableGrid"/>
-        <w:tblW w:type="auto" w:w="0"/>
+        <w:tblW w:type="dxa" w:w="9411"/>
+        <w:jc w:val="left"/>
         <w:tblLayout w:type="fixed"/>
         <w:tblLook w:firstColumn="1" w:firstRow="1" w:lastColumn="0" w:lastRow="0" w:noHBand="0" w:noVBand="1" w:val="04A0"/>
         <w:tblBorders>
@@ -1395,6 +1448,7 @@
           <w:p>
             <w:pPr>
               <w:spacing w:after="100" w:before="100"/>
+              <w:ind w:firstLine="0" w:left="0"/>
             </w:pPr>
             <w:r>
               <w:rPr>
@@ -1414,6 +1468,7 @@
           <w:p>
             <w:pPr>
               <w:spacing w:after="100" w:before="100"/>
+              <w:ind w:firstLine="0" w:left="0"/>
             </w:pPr>
             <w:r>
               <w:rPr>
@@ -1433,6 +1488,7 @@
           <w:p>
             <w:pPr>
               <w:spacing w:after="100" w:before="100"/>
+              <w:ind w:firstLine="0" w:left="0"/>
             </w:pPr>
             <w:r>
               <w:rPr>
@@ -1456,6 +1512,7 @@
           <w:p>
             <w:pPr>
               <w:spacing w:after="100" w:before="100"/>
+              <w:ind w:firstLine="0" w:left="0"/>
             </w:pPr>
             <w:r>
               <w:rPr>
@@ -1474,6 +1531,7 @@
           <w:p>
             <w:pPr>
               <w:spacing w:after="100" w:before="100"/>
+              <w:ind w:firstLine="0" w:left="0"/>
             </w:pPr>
             <w:r>
               <w:rPr>
@@ -1492,6 +1550,7 @@
           <w:p>
             <w:pPr>
               <w:spacing w:after="100" w:before="100"/>
+              <w:ind w:firstLine="0" w:left="0"/>
             </w:pPr>
             <w:r>
               <w:rPr>
@@ -1533,7 +1592,8 @@
     <w:tbl>
       <w:tblPr>
         <w:tblStyle w:val="TableGrid"/>
-        <w:tblW w:type="auto" w:w="0"/>
+        <w:tblW w:type="dxa" w:w="9411"/>
+        <w:jc w:val="left"/>
         <w:tblLayout w:type="fixed"/>
         <w:tblLook w:firstColumn="1" w:firstRow="1" w:lastColumn="0" w:lastRow="0" w:noHBand="0" w:noVBand="1" w:val="04A0"/>
         <w:tblBorders>
@@ -1564,6 +1624,7 @@
           <w:p>
             <w:pPr>
               <w:spacing w:after="100" w:before="100"/>
+              <w:ind w:firstLine="0" w:left="0"/>
             </w:pPr>
             <w:r>
               <w:rPr>
@@ -1583,6 +1644,7 @@
           <w:p>
             <w:pPr>
               <w:spacing w:after="100" w:before="100"/>
+              <w:ind w:firstLine="0" w:left="0"/>
             </w:pPr>
             <w:r>
               <w:rPr>
@@ -1602,6 +1664,7 @@
           <w:p>
             <w:pPr>
               <w:spacing w:after="100" w:before="100"/>
+              <w:ind w:firstLine="0" w:left="0"/>
             </w:pPr>
             <w:r>
               <w:rPr>
@@ -1625,6 +1688,7 @@
           <w:p>
             <w:pPr>
               <w:spacing w:after="100" w:before="100"/>
+              <w:ind w:firstLine="0" w:left="0"/>
             </w:pPr>
             <w:r>
               <w:rPr>
@@ -1643,6 +1707,7 @@
           <w:p>
             <w:pPr>
               <w:spacing w:after="100" w:before="100"/>
+              <w:ind w:firstLine="0" w:left="0"/>
             </w:pPr>
             <w:r>
               <w:rPr>
@@ -1661,6 +1726,7 @@
           <w:p>
             <w:pPr>
               <w:spacing w:after="100" w:before="100"/>
+              <w:ind w:firstLine="0" w:left="0"/>
             </w:pPr>
             <w:r>
               <w:rPr>
@@ -1761,7 +1827,8 @@
     <w:tbl>
       <w:tblPr>
         <w:tblStyle w:val="TableGrid"/>
-        <w:tblW w:type="auto" w:w="0"/>
+        <w:tblW w:type="dxa" w:w="9412"/>
+        <w:jc w:val="left"/>
         <w:tblLayout w:type="fixed"/>
         <w:tblLook w:firstColumn="1" w:firstRow="1" w:lastColumn="0" w:lastRow="0" w:noHBand="0" w:noVBand="1" w:val="04A0"/>
         <w:tblBorders>
@@ -1792,6 +1859,7 @@
           <w:p>
             <w:pPr>
               <w:spacing w:after="100" w:before="100"/>
+              <w:ind w:firstLine="0" w:left="0"/>
             </w:pPr>
             <w:r>
               <w:rPr>
@@ -1811,6 +1879,7 @@
           <w:p>
             <w:pPr>
               <w:spacing w:after="100" w:before="100"/>
+              <w:ind w:firstLine="0" w:left="0"/>
             </w:pPr>
             <w:r>
               <w:rPr>
@@ -1830,6 +1899,7 @@
           <w:p>
             <w:pPr>
               <w:spacing w:after="100" w:before="100"/>
+              <w:ind w:firstLine="0" w:left="0"/>
             </w:pPr>
             <w:r>
               <w:rPr>
@@ -1853,6 +1923,7 @@
           <w:p>
             <w:pPr>
               <w:spacing w:after="100" w:before="100"/>
+              <w:ind w:firstLine="0" w:left="0"/>
             </w:pPr>
             <w:r>
               <w:rPr>
@@ -1871,6 +1942,7 @@
           <w:p>
             <w:pPr>
               <w:spacing w:after="100" w:before="100"/>
+              <w:ind w:firstLine="0" w:left="0"/>
             </w:pPr>
             <w:r>
               <w:rPr>
@@ -1889,6 +1961,7 @@
           <w:p>
             <w:pPr>
               <w:spacing w:after="100" w:before="100"/>
+              <w:ind w:firstLine="0" w:left="0"/>
             </w:pPr>
             <w:r>
               <w:rPr>
@@ -1981,7 +2054,8 @@
     <w:tbl>
       <w:tblPr>
         <w:tblStyle w:val="TableGrid"/>
-        <w:tblW w:type="auto" w:w="0"/>
+        <w:tblW w:type="dxa" w:w="9411"/>
+        <w:jc w:val="left"/>
         <w:tblLayout w:type="fixed"/>
         <w:tblLook w:firstColumn="1" w:firstRow="1" w:lastColumn="0" w:lastRow="0" w:noHBand="0" w:noVBand="1" w:val="04A0"/>
         <w:tblBorders>
@@ -2012,6 +2086,7 @@
           <w:p>
             <w:pPr>
               <w:spacing w:after="100" w:before="100"/>
+              <w:ind w:firstLine="0" w:left="0"/>
             </w:pPr>
             <w:r>
               <w:rPr>
@@ -2031,6 +2106,7 @@
           <w:p>
             <w:pPr>
               <w:spacing w:after="100" w:before="100"/>
+              <w:ind w:firstLine="0" w:left="0"/>
             </w:pPr>
             <w:r>
               <w:rPr>
@@ -2050,6 +2126,7 @@
           <w:p>
             <w:pPr>
               <w:spacing w:after="100" w:before="100"/>
+              <w:ind w:firstLine="0" w:left="0"/>
             </w:pPr>
             <w:r>
               <w:rPr>
@@ -2073,6 +2150,7 @@
           <w:p>
             <w:pPr>
               <w:spacing w:after="100" w:before="100"/>
+              <w:ind w:firstLine="0" w:left="0"/>
             </w:pPr>
             <w:r>
               <w:rPr>
@@ -2091,6 +2169,7 @@
           <w:p>
             <w:pPr>
               <w:spacing w:after="100" w:before="100"/>
+              <w:ind w:firstLine="0" w:left="0"/>
             </w:pPr>
             <w:r>
               <w:rPr>
@@ -2109,6 +2188,7 @@
           <w:p>
             <w:pPr>
               <w:spacing w:after="100" w:before="100"/>
+              <w:ind w:firstLine="0" w:left="0"/>
             </w:pPr>
             <w:r>
               <w:rPr>

</xml_diff>